<commit_message>
CFC motion brief: docx/render.sh (its page measure and RCFC 5.4(b)(1) check), make-reference.sh and reference.docx give way to fb render: docx/reference.xml (base="xengine" with the builder's arguments and Keep With Next), uscfc-motion-brief.lua scanning the body before its filters and writing its needles in document order (each heading with the text after it, each authority link), a #section line for the body, the body's section in $FORMBOOK_FINAL, and the page limit (40, 50 for a cross-motion) checked on the page of the certificate's signature (tested: a 41-page body fails). The authorities take their pages from their links, as typst counts them (the measure searched each link's text on every body page). .docx.pdf byte-identical to the render before the port; baseline entries removed; check.sh typst and docx 0 failed, XENG-001..003 pass (fb-595.68.2)
</commit_message>
<xml_diff>
--- a/courts/federal-circuit/court-of-federal-claims/motion-brief/usage/OUTPUT-motion-brief.docx
+++ b/courts/federal-circuit/court-of-federal-claims/motion-brief/usage/OUTPUT-motion-brief.docx
@@ -6652,6 +6652,72 @@
     </w:p>
   </w:footnote>
 </w:footnotes>
+</file>
+
+<file path=word/ftr-add.xml><?xml version="1.0" encoding="utf-8"?>
+<w:ftr xmlns:w="http://schemas.openxmlformats.org/wordprocessingml/2006/main" xmlns:r="http://schemas.openxmlformats.org/officeDocument/2006/relationships">
+  <w:p>
+    <w:pPr>
+      <w:spacing w:before="0" w:after="0"/>
+      <w:jc w:val="center"/>
+    </w:pPr>
+    <w:r>
+      <w:t>Add-</w:t>
+    </w:r>
+    <w:r>
+      <w:fldChar w:fldCharType="begin"/>
+    </w:r>
+    <w:r>
+      <w:instrText xml:space="preserve"> PAGE </w:instrText>
+    </w:r>
+    <w:r>
+      <w:fldChar w:fldCharType="separate"/>
+    </w:r>
+    <w:r>
+      <w:t>1</w:t>
+    </w:r>
+    <w:r>
+      <w:fldChar w:fldCharType="end"/>
+    </w:r>
+  </w:p>
+</w:ftr>
+</file>
+
+<file path=word/ftr-none.xml><?xml version="1.0" encoding="utf-8"?>
+<w:ftr xmlns:w="http://schemas.openxmlformats.org/wordprocessingml/2006/main" xmlns:r="http://schemas.openxmlformats.org/officeDocument/2006/relationships">
+  <w:p>
+    <w:pPr>
+      <w:spacing w:before="0" w:after="0"/>
+      <w:jc w:val="center"/>
+    </w:pPr>
+  </w:p>
+</w:ftr>
+</file>
+
+<file path=word/ftr-page.xml><?xml version="1.0" encoding="utf-8"?>
+<w:ftr xmlns:w="http://schemas.openxmlformats.org/wordprocessingml/2006/main" xmlns:r="http://schemas.openxmlformats.org/officeDocument/2006/relationships">
+  <w:p>
+    <w:pPr>
+      <w:spacing w:before="0" w:after="0"/>
+      <w:jc w:val="center"/>
+    </w:pPr>
+    <w:r>
+      <w:fldChar w:fldCharType="begin"/>
+    </w:r>
+    <w:r>
+      <w:instrText xml:space="preserve"> PAGE </w:instrText>
+    </w:r>
+    <w:r>
+      <w:fldChar w:fldCharType="separate"/>
+    </w:r>
+    <w:r>
+      <w:t>1</w:t>
+    </w:r>
+    <w:r>
+      <w:fldChar w:fldCharType="end"/>
+    </w:r>
+  </w:p>
+</w:ftr>
 </file>
 
 <file path=word/numbering.xml><?xml version="1.0" encoding="utf-8"?>

</xml_diff>